<commit_message>
beautifies some figures with places and sizes
</commit_message>
<xml_diff>
--- a/Labs/Lab1/group15 lab1.docx
+++ b/Labs/Lab1/group15 lab1.docx
@@ -453,7 +453,7 @@
                   <w:pPr>
                     <w:ind w:firstLineChars="0" w:firstLine="0"/>
                     <w:rPr>
-                      <w:rFonts w:asciiTheme="minorEastAsia" w:eastAsiaTheme="minorEastAsia" w:hAnsiTheme="minorEastAsia" w:hint="eastAsia"/>
+                      <w:rFonts w:asciiTheme="minorEastAsia" w:eastAsiaTheme="minorEastAsia" w:hAnsiTheme="minorEastAsia"/>
                     </w:rPr>
                   </w:pPr>
                   <w:r>
@@ -676,52 +676,22 @@
         </w:rPr>
       </w:pPr>
       <w:r>
-        <w:t>This experiment can be further divided into two sub-experiments: LDR1 &amp;LDR2 both connected to ground, and LDR1 &amp;LDR2 both connected to the power supply.</w:t>
-      </w:r>
-      <w:r>
-        <w:rPr>
-          <w:rFonts w:hint="eastAsia"/>
-        </w:rPr>
-        <w:t xml:space="preserve"> </w:t>
-      </w:r>
-      <w:r>
-        <w:rPr>
-          <w:rFonts w:ascii="宋体" w:eastAsia="宋体" w:hAnsi="宋体" w:cs="宋体" w:hint="eastAsia"/>
-        </w:rPr>
-        <w:t>（</w:t>
-      </w:r>
-      <w:r>
-        <w:t xml:space="preserve">Fixed resistor resistance value: 1 </w:t>
-      </w:r>
-      <w:proofErr w:type="spellStart"/>
-      <w:r>
-        <w:t>kΩ</w:t>
-      </w:r>
-      <w:proofErr w:type="spellEnd"/>
-      <w:r>
-        <w:rPr>
-          <w:rFonts w:ascii="宋体" w:eastAsia="宋体" w:hAnsi="宋体" w:cs="宋体" w:hint="eastAsia"/>
-        </w:rPr>
-        <w:t>）</w:t>
-      </w:r>
-    </w:p>
-    <w:p>
-      <w:pPr>
-        <w:ind w:firstLine="480"/>
-        <w:jc w:val="center"/>
-        <w:rPr>
-          <w:rFonts w:eastAsiaTheme="minorEastAsia"/>
-        </w:rPr>
-      </w:pPr>
-      <w:r>
         <w:rPr>
           <w:rFonts w:eastAsiaTheme="minorEastAsia" w:hint="eastAsia"/>
           <w:noProof/>
         </w:rPr>
         <w:drawing>
-          <wp:inline distT="0" distB="0" distL="0" distR="0" wp14:anchorId="73BD3E5A" wp14:editId="255A4BF0">
-            <wp:extent cx="2296180" cy="2602341"/>
-            <wp:effectExtent l="0" t="635" r="8255" b="8255"/>
+          <wp:anchor distT="0" distB="0" distL="114300" distR="114300" simplePos="0" relativeHeight="251663360" behindDoc="0" locked="0" layoutInCell="1" allowOverlap="1" wp14:anchorId="73BD3E5A" wp14:editId="57EC8C53">
+            <wp:simplePos x="0" y="0"/>
+            <wp:positionH relativeFrom="column">
+              <wp:posOffset>430530</wp:posOffset>
+            </wp:positionH>
+            <wp:positionV relativeFrom="paragraph">
+              <wp:posOffset>455930</wp:posOffset>
+            </wp:positionV>
+            <wp:extent cx="2422525" cy="2745105"/>
+            <wp:effectExtent l="3810" t="0" r="0" b="0"/>
+            <wp:wrapTopAndBottom/>
             <wp:docPr id="904850419" name="图片 2"/>
             <wp:cNvGraphicFramePr>
               <a:graphicFrameLocks xmlns:a="http://schemas.openxmlformats.org/drawingml/2006/main" noChangeAspect="1"/>
@@ -749,7 +719,7 @@
                   <pic:spPr bwMode="auto">
                     <a:xfrm rot="5400000">
                       <a:off x="0" y="0"/>
-                      <a:ext cx="2318975" cy="2628176"/>
+                      <a:ext cx="2422525" cy="2745105"/>
                     </a:xfrm>
                     <a:prstGeom prst="rect">
                       <a:avLst/>
@@ -767,41 +737,32 @@
                 </pic:pic>
               </a:graphicData>
             </a:graphic>
-          </wp:inline>
+            <wp14:sizeRelH relativeFrom="page">
+              <wp14:pctWidth>0</wp14:pctWidth>
+            </wp14:sizeRelH>
+            <wp14:sizeRelV relativeFrom="page">
+              <wp14:pctHeight>0</wp14:pctHeight>
+            </wp14:sizeRelV>
+          </wp:anchor>
         </w:drawing>
       </w:r>
-    </w:p>
-    <w:p>
-      <w:pPr>
-        <w:pStyle w:val="a"/>
-        <w:rPr>
-          <w:rFonts w:eastAsiaTheme="minorEastAsia"/>
-        </w:rPr>
-      </w:pPr>
-      <w:r>
-        <w:rPr>
-          <w:rFonts w:eastAsiaTheme="minorEastAsia" w:hint="eastAsia"/>
-        </w:rPr>
-        <w:t>Grounding</w:t>
-      </w:r>
-    </w:p>
-    <w:p>
-      <w:pPr>
-        <w:ind w:firstLine="480"/>
-        <w:jc w:val="center"/>
-        <w:rPr>
-          <w:rFonts w:eastAsiaTheme="minorEastAsia"/>
-        </w:rPr>
-      </w:pPr>
       <w:r>
         <w:rPr>
           <w:rFonts w:eastAsiaTheme="minorEastAsia" w:hint="eastAsia"/>
           <w:noProof/>
         </w:rPr>
         <w:drawing>
-          <wp:inline distT="0" distB="0" distL="0" distR="0" wp14:anchorId="6EF9F547" wp14:editId="32D15FF0">
-            <wp:extent cx="2611972" cy="2424113"/>
-            <wp:effectExtent l="0" t="0" r="0" b="0"/>
+          <wp:anchor distT="0" distB="0" distL="114300" distR="114300" simplePos="0" relativeHeight="251664384" behindDoc="0" locked="0" layoutInCell="1" allowOverlap="1" wp14:anchorId="6EF9F547" wp14:editId="15D033B1">
+            <wp:simplePos x="0" y="0"/>
+            <wp:positionH relativeFrom="column">
+              <wp:posOffset>3013710</wp:posOffset>
+            </wp:positionH>
+            <wp:positionV relativeFrom="paragraph">
+              <wp:posOffset>615950</wp:posOffset>
+            </wp:positionV>
+            <wp:extent cx="2611755" cy="2423795"/>
+            <wp:effectExtent l="0" t="0" r="4445" b="1905"/>
+            <wp:wrapTopAndBottom/>
             <wp:docPr id="1946338582" name="图片 4"/>
             <wp:cNvGraphicFramePr>
               <a:graphicFrameLocks xmlns:a="http://schemas.openxmlformats.org/drawingml/2006/main" noChangeAspect="1"/>
@@ -829,7 +790,7 @@
                   <pic:spPr bwMode="auto">
                     <a:xfrm>
                       <a:off x="0" y="0"/>
-                      <a:ext cx="2641447" cy="2451468"/>
+                      <a:ext cx="2611755" cy="2423795"/>
                     </a:xfrm>
                     <a:prstGeom prst="rect">
                       <a:avLst/>
@@ -847,8 +808,72 @@
                 </pic:pic>
               </a:graphicData>
             </a:graphic>
-          </wp:inline>
+            <wp14:sizeRelH relativeFrom="page">
+              <wp14:pctWidth>0</wp14:pctWidth>
+            </wp14:sizeRelH>
+            <wp14:sizeRelV relativeFrom="page">
+              <wp14:pctHeight>0</wp14:pctHeight>
+            </wp14:sizeRelV>
+          </wp:anchor>
         </w:drawing>
+      </w:r>
+      <w:r>
+        <w:t>This experiment can be further divided into two sub-experiments: LDR1 &amp;</w:t>
+      </w:r>
+      <w:r>
+        <w:t xml:space="preserve"> </w:t>
+      </w:r>
+      <w:r>
+        <w:t>LDR2 both connected to ground, and LDR1 &amp;LDR2 both connected to the power supply.</w:t>
+      </w:r>
+      <w:r>
+        <w:rPr>
+          <w:rFonts w:hint="eastAsia"/>
+        </w:rPr>
+        <w:t xml:space="preserve"> </w:t>
+      </w:r>
+      <w:r>
+        <w:rPr>
+          <w:rFonts w:ascii="宋体" w:eastAsia="宋体" w:hAnsi="宋体" w:cs="宋体" w:hint="eastAsia"/>
+        </w:rPr>
+        <w:t>（</w:t>
+      </w:r>
+      <w:r>
+        <w:t xml:space="preserve">Fixed resistor resistance value: 1 </w:t>
+      </w:r>
+      <w:proofErr w:type="spellStart"/>
+      <w:r>
+        <w:t>kΩ</w:t>
+      </w:r>
+      <w:proofErr w:type="spellEnd"/>
+      <w:r>
+        <w:rPr>
+          <w:rFonts w:ascii="宋体" w:eastAsia="宋体" w:hAnsi="宋体" w:cs="宋体" w:hint="eastAsia"/>
+        </w:rPr>
+        <w:t>）</w:t>
+      </w:r>
+    </w:p>
+    <w:p>
+      <w:pPr>
+        <w:ind w:firstLine="480"/>
+        <w:jc w:val="center"/>
+        <w:rPr>
+          <w:rFonts w:eastAsiaTheme="minorEastAsia"/>
+        </w:rPr>
+      </w:pPr>
+    </w:p>
+    <w:p>
+      <w:pPr>
+        <w:pStyle w:val="a"/>
+        <w:rPr>
+          <w:rFonts w:eastAsiaTheme="minorEastAsia"/>
+        </w:rPr>
+      </w:pPr>
+      <w:r>
+        <w:rPr>
+          <w:rFonts w:eastAsiaTheme="minorEastAsia" w:hint="eastAsia"/>
+        </w:rPr>
+        <w:t>Grounding</w:t>
       </w:r>
     </w:p>
     <w:p>
@@ -1279,7 +1304,11 @@
         <w:t>Finally, get the corresponding sensorValue1 and sensorValue2 from the IDE's Serial Monitor. Then, using a sixth-order polynomial fitting, 300 points are inserted between the two data points to obtain a smooth curve.</w:t>
       </w:r>
       <w:r>
-        <w:t xml:space="preserve"> The drawing of the image in the following experiments will use the same method, so we will not repeat it.</w:t>
+        <w:t xml:space="preserve"> The drawing of the image in the following experiments will </w:t>
+      </w:r>
+      <w:r>
+        <w:lastRenderedPageBreak/>
+        <w:t>use the same method, so we will not repeat it.</w:t>
       </w:r>
     </w:p>
     <w:p>
@@ -1535,9 +1564,8 @@
           <w:rFonts w:eastAsiaTheme="minorEastAsia"/>
           <w:noProof/>
         </w:rPr>
-        <w:lastRenderedPageBreak/>
         <w:drawing>
-          <wp:inline distT="0" distB="0" distL="0" distR="0" wp14:anchorId="7E6E1AB6" wp14:editId="50EA80EB">
+          <wp:inline distT="0" distB="0" distL="0" distR="0" wp14:anchorId="7E6E1AB6" wp14:editId="27C30994">
             <wp:extent cx="4305300" cy="2497626"/>
             <wp:effectExtent l="0" t="0" r="0" b="0"/>
             <wp:docPr id="1473125329" name="图片 1"/>
@@ -1560,7 +1588,7 @@
                   <pic:spPr>
                     <a:xfrm>
                       <a:off x="0" y="0"/>
-                      <a:ext cx="4331499" cy="2512825"/>
+                      <a:ext cx="4305300" cy="2497626"/>
                     </a:xfrm>
                     <a:prstGeom prst="rect">
                       <a:avLst/>
@@ -1614,6 +1642,7 @@
           <w:bCs/>
           <w:noProof/>
         </w:rPr>
+        <w:lastRenderedPageBreak/>
         <w:drawing>
           <wp:anchor distT="0" distB="0" distL="114300" distR="114300" simplePos="0" relativeHeight="251660288" behindDoc="0" locked="0" layoutInCell="1" allowOverlap="1" wp14:anchorId="537FECA6" wp14:editId="5A7F58D4">
             <wp:simplePos x="0" y="0"/>
@@ -1905,81 +1934,83 @@
         <w:rPr>
           <w:rFonts w:eastAsia="宋体"/>
         </w:rPr>
-        <w:t xml:space="preserve">ADC, the polar </w:t>
-      </w:r>
-      <w:r>
+        <w:t>ADC, the polar differences are calculated and compared.</w:t>
+      </w:r>
+    </w:p>
+    <w:p>
+      <w:pPr>
+        <w:ind w:firstLine="480"/>
         <w:rPr>
           <w:rFonts w:eastAsia="宋体"/>
         </w:rPr>
+      </w:pPr>
+    </w:p>
+    <w:p>
+      <w:pPr>
+        <w:pStyle w:val="2"/>
+        <w:rPr>
+          <w:rFonts w:eastAsia="宋体"/>
+        </w:rPr>
+      </w:pPr>
+      <w:r>
+        <w:t>Experiment 4: Investigating the Resistance Difference Between Two LDRs Under Identical Light Conditions</w:t>
+      </w:r>
+    </w:p>
+    <w:p>
+      <w:pPr>
+        <w:ind w:firstLine="480"/>
+        <w:rPr>
+          <w:rFonts w:eastAsia="宋体"/>
+        </w:rPr>
+      </w:pPr>
+      <w:r>
+        <w:rPr>
+          <w:rFonts w:eastAsia="宋体"/>
+        </w:rPr>
+        <w:t>This experiment can be further divided into two sub-experiments: LDR1 &amp;amp; LDR2 both connected to ground, and LDR1 &amp;amp; LDR2 both connected to the power supply.</w:t>
+      </w:r>
+    </w:p>
+    <w:p>
+      <w:pPr>
+        <w:ind w:firstLine="480"/>
+        <w:rPr>
+          <w:rFonts w:eastAsia="宋体"/>
+        </w:rPr>
+      </w:pPr>
+      <w:r>
+        <w:rPr>
+          <w:rFonts w:eastAsia="宋体"/>
+        </w:rPr>
+        <w:t>LDR1 and LDR2 are placed in separate circuits with a controlled variable, keeping the voltage and the voltage divider resistors consistent.</w:t>
+      </w:r>
+    </w:p>
+    <w:p>
+      <w:pPr>
+        <w:ind w:firstLine="480"/>
+        <w:jc w:val="center"/>
+        <w:rPr>
+          <w:rFonts w:eastAsiaTheme="minorEastAsia"/>
+        </w:rPr>
+      </w:pPr>
+      <w:r>
+        <w:rPr>
+          <w:rFonts w:eastAsia="宋体" w:hint="eastAsia"/>
+          <w:noProof/>
+        </w:rPr>
         <w:lastRenderedPageBreak/>
-        <w:t>differences are calculated and compared.</w:t>
-      </w:r>
-    </w:p>
-    <w:p>
-      <w:pPr>
-        <w:ind w:firstLine="480"/>
-        <w:rPr>
-          <w:rFonts w:eastAsia="宋体"/>
-        </w:rPr>
-      </w:pPr>
-    </w:p>
-    <w:p>
-      <w:pPr>
-        <w:pStyle w:val="2"/>
-        <w:rPr>
-          <w:rFonts w:eastAsia="宋体"/>
-        </w:rPr>
-      </w:pPr>
-      <w:r>
-        <w:t>Experiment 4: Investigating the Resistance Difference Between Two LDRs Under Identical Light Conditions</w:t>
-      </w:r>
-    </w:p>
-    <w:p>
-      <w:pPr>
-        <w:ind w:firstLine="480"/>
-        <w:rPr>
-          <w:rFonts w:eastAsia="宋体"/>
-        </w:rPr>
-      </w:pPr>
-      <w:r>
-        <w:rPr>
-          <w:rFonts w:eastAsia="宋体"/>
-        </w:rPr>
-        <w:t>This experiment can be further divided into two sub-experiments: LDR1 &amp;amp; LDR2 both connected to ground, and LDR1 &amp;amp; LDR2 both connected to the power supply.</w:t>
-      </w:r>
-    </w:p>
-    <w:p>
-      <w:pPr>
-        <w:ind w:firstLine="480"/>
-        <w:rPr>
-          <w:rFonts w:eastAsia="宋体"/>
-        </w:rPr>
-      </w:pPr>
-      <w:r>
-        <w:rPr>
-          <w:rFonts w:eastAsia="宋体"/>
-        </w:rPr>
-        <w:t>LDR1 and LDR2 are placed in separate circuits with a controlled variable, keeping the voltage and the voltage divider resistors consistent.</w:t>
-      </w:r>
-    </w:p>
-    <w:p>
-      <w:pPr>
-        <w:ind w:firstLine="480"/>
-        <w:jc w:val="center"/>
-        <w:rPr>
-          <w:rFonts w:eastAsiaTheme="minorEastAsia"/>
-        </w:rPr>
-      </w:pPr>
-      <w:r>
-        <w:rPr>
-          <w:rFonts w:hint="eastAsia"/>
-          <w:noProof/>
-        </w:rPr>
         <w:drawing>
-          <wp:inline distT="0" distB="0" distL="0" distR="0" wp14:anchorId="46DB43F5" wp14:editId="4BC3FCFB">
-            <wp:extent cx="2871235" cy="2328228"/>
-            <wp:effectExtent l="0" t="0" r="5715" b="0"/>
-            <wp:docPr id="481504733" name="图片 2"/>
+          <wp:anchor distT="0" distB="0" distL="114300" distR="114300" simplePos="0" relativeHeight="251666432" behindDoc="0" locked="0" layoutInCell="1" allowOverlap="1" wp14:anchorId="6D3B170C" wp14:editId="2964A9BB">
+            <wp:simplePos x="0" y="0"/>
+            <wp:positionH relativeFrom="column">
+              <wp:posOffset>3014345</wp:posOffset>
+            </wp:positionH>
+            <wp:positionV relativeFrom="paragraph">
+              <wp:posOffset>0</wp:posOffset>
+            </wp:positionV>
+            <wp:extent cx="2870200" cy="2327910"/>
+            <wp:effectExtent l="0" t="0" r="0" b="0"/>
+            <wp:wrapTopAndBottom/>
+            <wp:docPr id="438160263" name="图片 3"/>
             <wp:cNvGraphicFramePr>
               <a:graphicFrameLocks xmlns:a="http://schemas.openxmlformats.org/drawingml/2006/main" noChangeAspect="1"/>
             </wp:cNvGraphicFramePr>
@@ -1987,7 +2018,7 @@
               <a:graphicData uri="http://schemas.openxmlformats.org/drawingml/2006/picture">
                 <pic:pic xmlns:pic="http://schemas.openxmlformats.org/drawingml/2006/picture">
                   <pic:nvPicPr>
-                    <pic:cNvPr id="0" name="Picture 6"/>
+                    <pic:cNvPr id="0" name="Picture 8"/>
                     <pic:cNvPicPr>
                       <a:picLocks noChangeAspect="1" noChangeArrowheads="1"/>
                     </pic:cNvPicPr>
@@ -2000,13 +2031,13 @@
                         </a:ext>
                       </a:extLst>
                     </a:blip>
-                    <a:srcRect t="27821" b="11373"/>
+                    <a:srcRect t="21332" b="17862"/>
                     <a:stretch/>
                   </pic:blipFill>
                   <pic:spPr bwMode="auto">
                     <a:xfrm>
                       <a:off x="0" y="0"/>
-                      <a:ext cx="2888709" cy="2342398"/>
+                      <a:ext cx="2870200" cy="2327910"/>
                     </a:xfrm>
                     <a:prstGeom prst="rect">
                       <a:avLst/>
@@ -2024,52 +2055,33 @@
                 </pic:pic>
               </a:graphicData>
             </a:graphic>
-          </wp:inline>
+            <wp14:sizeRelH relativeFrom="page">
+              <wp14:pctWidth>0</wp14:pctWidth>
+            </wp14:sizeRelH>
+            <wp14:sizeRelV relativeFrom="page">
+              <wp14:pctHeight>0</wp14:pctHeight>
+            </wp14:sizeRelV>
+          </wp:anchor>
         </w:drawing>
       </w:r>
-    </w:p>
-    <w:p>
-      <w:pPr>
-        <w:pStyle w:val="a"/>
-        <w:rPr>
-          <w:rFonts w:eastAsiaTheme="minorEastAsia"/>
-        </w:rPr>
-      </w:pPr>
-      <w:r>
-        <w:rPr>
-          <w:rFonts w:eastAsiaTheme="minorEastAsia"/>
-        </w:rPr>
-        <w:t>B</w:t>
-      </w:r>
-      <w:r>
-        <w:rPr>
-          <w:rFonts w:eastAsiaTheme="minorEastAsia" w:hint="eastAsia"/>
-        </w:rPr>
-        <w:t>oth power supply</w:t>
-      </w:r>
-    </w:p>
-    <w:p>
-      <w:pPr>
-        <w:widowControl/>
-        <w:spacing w:before="100" w:beforeAutospacing="1" w:after="100" w:afterAutospacing="1"/>
-        <w:ind w:firstLineChars="0" w:firstLine="0"/>
-        <w:jc w:val="center"/>
-        <w:rPr>
-          <w:rFonts w:ascii="宋体" w:eastAsia="宋体" w:hAnsi="宋体" w:cs="宋体" w:hint="eastAsia"/>
-          <w:kern w:val="0"/>
-          <w14:ligatures w14:val="none"/>
-        </w:rPr>
-      </w:pPr>
-      <w:r>
-        <w:rPr>
-          <w:rFonts w:eastAsia="宋体" w:hint="eastAsia"/>
+      <w:r>
+        <w:rPr>
+          <w:rFonts w:hint="eastAsia"/>
           <w:noProof/>
         </w:rPr>
         <w:drawing>
-          <wp:inline distT="0" distB="0" distL="0" distR="0" wp14:anchorId="6D3B170C" wp14:editId="75B56A82">
-            <wp:extent cx="3071695" cy="2490787"/>
-            <wp:effectExtent l="0" t="0" r="0" b="5080"/>
-            <wp:docPr id="438160263" name="图片 3"/>
+          <wp:anchor distT="0" distB="0" distL="114300" distR="114300" simplePos="0" relativeHeight="251665408" behindDoc="0" locked="0" layoutInCell="1" allowOverlap="1" wp14:anchorId="46DB43F5" wp14:editId="5366CA1D">
+            <wp:simplePos x="0" y="0"/>
+            <wp:positionH relativeFrom="column">
+              <wp:posOffset>144296</wp:posOffset>
+            </wp:positionH>
+            <wp:positionV relativeFrom="paragraph">
+              <wp:posOffset>6</wp:posOffset>
+            </wp:positionV>
+            <wp:extent cx="2871235" cy="2328228"/>
+            <wp:effectExtent l="0" t="0" r="2540" b="0"/>
+            <wp:wrapTopAndBottom/>
+            <wp:docPr id="481504733" name="图片 2"/>
             <wp:cNvGraphicFramePr>
               <a:graphicFrameLocks xmlns:a="http://schemas.openxmlformats.org/drawingml/2006/main" noChangeAspect="1"/>
             </wp:cNvGraphicFramePr>
@@ -2077,7 +2089,7 @@
               <a:graphicData uri="http://schemas.openxmlformats.org/drawingml/2006/picture">
                 <pic:pic xmlns:pic="http://schemas.openxmlformats.org/drawingml/2006/picture">
                   <pic:nvPicPr>
-                    <pic:cNvPr id="0" name="Picture 8"/>
+                    <pic:cNvPr id="0" name="Picture 6"/>
                     <pic:cNvPicPr>
                       <a:picLocks noChangeAspect="1" noChangeArrowheads="1"/>
                     </pic:cNvPicPr>
@@ -2090,13 +2102,13 @@
                         </a:ext>
                       </a:extLst>
                     </a:blip>
-                    <a:srcRect t="21332" b="17862"/>
+                    <a:srcRect t="27821" b="11373"/>
                     <a:stretch/>
                   </pic:blipFill>
                   <pic:spPr bwMode="auto">
                     <a:xfrm>
                       <a:off x="0" y="0"/>
-                      <a:ext cx="3081264" cy="2498546"/>
+                      <a:ext cx="2871235" cy="2328228"/>
                     </a:xfrm>
                     <a:prstGeom prst="rect">
                       <a:avLst/>
@@ -2114,7 +2126,13 @@
                 </pic:pic>
               </a:graphicData>
             </a:graphic>
-          </wp:inline>
+            <wp14:sizeRelH relativeFrom="page">
+              <wp14:pctWidth>0</wp14:pctWidth>
+            </wp14:sizeRelH>
+            <wp14:sizeRelV relativeFrom="page">
+              <wp14:pctHeight>0</wp14:pctHeight>
+            </wp14:sizeRelV>
+          </wp:anchor>
         </w:drawing>
       </w:r>
     </w:p>
@@ -2122,6 +2140,26 @@
       <w:pPr>
         <w:pStyle w:val="a"/>
         <w:rPr>
+          <w:rFonts w:eastAsiaTheme="minorEastAsia"/>
+        </w:rPr>
+      </w:pPr>
+      <w:r>
+        <w:rPr>
+          <w:rFonts w:eastAsiaTheme="minorEastAsia"/>
+        </w:rPr>
+        <w:t>B</w:t>
+      </w:r>
+      <w:r>
+        <w:rPr>
+          <w:rFonts w:eastAsiaTheme="minorEastAsia" w:hint="eastAsia"/>
+        </w:rPr>
+        <w:t>oth power supply</w:t>
+      </w:r>
+    </w:p>
+    <w:p>
+      <w:pPr>
+        <w:pStyle w:val="a"/>
+        <w:rPr>
           <w:rFonts w:eastAsia="宋体"/>
         </w:rPr>
       </w:pPr>
@@ -2141,6 +2179,7 @@
     <w:p>
       <w:pPr>
         <w:ind w:firstLine="480"/>
+        <w:jc w:val="center"/>
       </w:pPr>
     </w:p>
     <w:p>
@@ -2275,7 +2314,6 @@
           <w:rFonts w:eastAsiaTheme="minorEastAsia"/>
           <w:noProof/>
         </w:rPr>
-        <w:lastRenderedPageBreak/>
         <w:drawing>
           <wp:inline distT="0" distB="0" distL="0" distR="0" wp14:anchorId="2E2249E8" wp14:editId="04AEA90E">
             <wp:extent cx="5943600" cy="1274445"/>
@@ -2388,14 +2426,16 @@
       <w:pPr>
         <w:widowControl/>
         <w:ind w:firstLine="480"/>
-        <w:rPr>
-          <w:rFonts w:eastAsiaTheme="minorEastAsia"/>
-        </w:rPr>
-      </w:pPr>
-      <w:r>
-        <w:rPr>
-          <w:rFonts w:eastAsiaTheme="minorEastAsia"/>
-        </w:rPr>
+        <w:jc w:val="center"/>
+        <w:rPr>
+          <w:rFonts w:eastAsiaTheme="minorEastAsia"/>
+        </w:rPr>
+      </w:pPr>
+      <w:r>
+        <w:rPr>
+          <w:rFonts w:eastAsiaTheme="minorEastAsia"/>
+        </w:rPr>
+        <w:lastRenderedPageBreak/>
         <w:t>The plotted curves are as follows:</w:t>
       </w:r>
       <w:r>
@@ -2411,9 +2451,9 @@
           <w:noProof/>
         </w:rPr>
         <w:drawing>
-          <wp:inline distT="0" distB="0" distL="0" distR="0" wp14:anchorId="21498FD3" wp14:editId="7B7FFB30">
-            <wp:extent cx="5943600" cy="1595120"/>
-            <wp:effectExtent l="0" t="0" r="0" b="5080"/>
+          <wp:inline distT="0" distB="0" distL="0" distR="0" wp14:anchorId="21498FD3" wp14:editId="3626F087">
+            <wp:extent cx="5851893" cy="2074545"/>
+            <wp:effectExtent l="0" t="0" r="3175" b="0"/>
             <wp:docPr id="641469354" name="图片 1"/>
             <wp:cNvGraphicFramePr>
               <a:graphicFrameLocks xmlns:a="http://schemas.openxmlformats.org/drawingml/2006/main" noChangeAspect="1"/>
@@ -2425,20 +2465,27 @@
                     <pic:cNvPr id="641469354" name=""/>
                     <pic:cNvPicPr/>
                   </pic:nvPicPr>
-                  <pic:blipFill>
+                  <pic:blipFill rotWithShape="1">
                     <a:blip r:embed="rId21"/>
-                    <a:stretch>
-                      <a:fillRect/>
-                    </a:stretch>
+                    <a:srcRect l="12187" r="12110"/>
+                    <a:stretch/>
                   </pic:blipFill>
-                  <pic:spPr>
+                  <pic:spPr bwMode="auto">
                     <a:xfrm>
                       <a:off x="0" y="0"/>
-                      <a:ext cx="5943600" cy="1595120"/>
+                      <a:ext cx="6472433" cy="2294532"/>
                     </a:xfrm>
                     <a:prstGeom prst="rect">
                       <a:avLst/>
                     </a:prstGeom>
+                    <a:ln>
+                      <a:noFill/>
+                    </a:ln>
+                    <a:extLst>
+                      <a:ext uri="{53640926-AAD7-44D8-BBD7-CCE9431645EC}">
+                        <a14:shadowObscured xmlns:a14="http://schemas.microsoft.com/office/drawing/2010/main"/>
+                      </a:ext>
+                    </a:extLst>
                   </pic:spPr>
                 </pic:pic>
               </a:graphicData>
@@ -2490,9 +2537,9 @@
           <w:noProof/>
         </w:rPr>
         <w:drawing>
-          <wp:inline distT="0" distB="0" distL="0" distR="0" wp14:anchorId="0F919628" wp14:editId="01A65E4B">
-            <wp:extent cx="5943600" cy="1595120"/>
-            <wp:effectExtent l="0" t="0" r="0" b="5080"/>
+          <wp:inline distT="0" distB="0" distL="0" distR="0" wp14:anchorId="0F919628" wp14:editId="48AF0C68">
+            <wp:extent cx="5869632" cy="2080834"/>
+            <wp:effectExtent l="0" t="0" r="0" b="2540"/>
             <wp:docPr id="913844431" name="图片 1"/>
             <wp:cNvGraphicFramePr>
               <a:graphicFrameLocks xmlns:a="http://schemas.openxmlformats.org/drawingml/2006/main" noChangeAspect="1"/>
@@ -2504,20 +2551,27 @@
                     <pic:cNvPr id="913844431" name=""/>
                     <pic:cNvPicPr/>
                   </pic:nvPicPr>
-                  <pic:blipFill>
+                  <pic:blipFill rotWithShape="1">
                     <a:blip r:embed="rId22"/>
-                    <a:stretch>
-                      <a:fillRect/>
-                    </a:stretch>
+                    <a:srcRect l="12187" r="12110"/>
+                    <a:stretch/>
                   </pic:blipFill>
-                  <pic:spPr>
+                  <pic:spPr bwMode="auto">
                     <a:xfrm>
                       <a:off x="0" y="0"/>
-                      <a:ext cx="5943600" cy="1595120"/>
+                      <a:ext cx="6173537" cy="2188571"/>
                     </a:xfrm>
                     <a:prstGeom prst="rect">
                       <a:avLst/>
                     </a:prstGeom>
+                    <a:ln>
+                      <a:noFill/>
+                    </a:ln>
+                    <a:extLst>
+                      <a:ext uri="{53640926-AAD7-44D8-BBD7-CCE9431645EC}">
+                        <a14:shadowObscured xmlns:a14="http://schemas.microsoft.com/office/drawing/2010/main"/>
+                      </a:ext>
+                    </a:extLst>
                   </pic:spPr>
                 </pic:pic>
               </a:graphicData>
@@ -2657,7 +2711,6 @@
         </w:rPr>
       </w:pPr>
       <w:r>
-        <w:lastRenderedPageBreak/>
         <w:t xml:space="preserve">Experiment </w:t>
       </w:r>
       <w:r>
@@ -2814,10 +2867,11 @@
           <w:rFonts w:eastAsia="宋体"/>
           <w:noProof/>
         </w:rPr>
+        <w:lastRenderedPageBreak/>
         <w:drawing>
-          <wp:inline distT="0" distB="0" distL="0" distR="0" wp14:anchorId="138F47D0" wp14:editId="70F56C66">
-            <wp:extent cx="3119438" cy="1862851"/>
-            <wp:effectExtent l="0" t="0" r="5080" b="4445"/>
+          <wp:inline distT="0" distB="0" distL="0" distR="0" wp14:anchorId="138F47D0" wp14:editId="5A39462F">
+            <wp:extent cx="3354309" cy="1830601"/>
+            <wp:effectExtent l="0" t="0" r="0" b="0"/>
             <wp:docPr id="383572999" name="图片 1"/>
             <wp:cNvGraphicFramePr>
               <a:graphicFrameLocks xmlns:a="http://schemas.openxmlformats.org/drawingml/2006/main" noChangeAspect="1"/>
@@ -2831,13 +2885,13 @@
                   </pic:nvPicPr>
                   <pic:blipFill rotWithShape="1">
                     <a:blip r:embed="rId24"/>
-                    <a:srcRect l="12663" t="15824" r="49507"/>
+                    <a:srcRect l="12663" t="17461" r="49507" b="5614"/>
                     <a:stretch/>
                   </pic:blipFill>
                   <pic:spPr bwMode="auto">
                     <a:xfrm>
                       <a:off x="0" y="0"/>
-                      <a:ext cx="3151745" cy="1882144"/>
+                      <a:ext cx="3431734" cy="1872855"/>
                     </a:xfrm>
                     <a:prstGeom prst="rect">
                       <a:avLst/>
@@ -3194,9 +3248,8 @@
           <w:bCs/>
           <w:noProof/>
         </w:rPr>
-        <w:lastRenderedPageBreak/>
         <w:drawing>
-          <wp:anchor distT="0" distB="0" distL="114300" distR="114300" simplePos="0" relativeHeight="251662336" behindDoc="0" locked="0" layoutInCell="1" allowOverlap="1" wp14:anchorId="15385237" wp14:editId="6649A3E5">
+          <wp:anchor distT="0" distB="0" distL="114300" distR="114300" simplePos="0" relativeHeight="251662336" behindDoc="0" locked="0" layoutInCell="1" allowOverlap="1" wp14:anchorId="15385237" wp14:editId="109230CC">
             <wp:simplePos x="0" y="0"/>
             <wp:positionH relativeFrom="column">
               <wp:posOffset>314008</wp:posOffset>
@@ -3347,6 +3400,7 @@
           <w:rFonts w:eastAsia="宋体"/>
           <w:noProof/>
         </w:rPr>
+        <w:lastRenderedPageBreak/>
         <w:drawing>
           <wp:inline distT="0" distB="0" distL="0" distR="0" wp14:anchorId="5CF614D7" wp14:editId="5B2C646F">
             <wp:extent cx="3238500" cy="1933952"/>
@@ -4053,34 +4107,34 @@
         </w:rPr>
       </w:pPr>
       <w:r>
+        <w:t xml:space="preserve">Experiment </w:t>
+      </w:r>
+      <w:r>
+        <w:rPr>
+          <w:rFonts w:eastAsiaTheme="minorEastAsia" w:hint="eastAsia"/>
+        </w:rPr>
+        <w:t>4</w:t>
+      </w:r>
+    </w:p>
+    <w:p>
+      <w:pPr>
+        <w:ind w:firstLine="480"/>
+        <w:rPr>
+          <w:rFonts w:eastAsiaTheme="minorEastAsia"/>
+        </w:rPr>
+      </w:pPr>
+      <w:r>
+        <w:rPr>
+          <w:rFonts w:eastAsiaTheme="minorEastAsia"/>
+        </w:rPr>
+        <w:t>When the light is swept from LDR1 to LDR2, the following data is obtained:</w:t>
+      </w:r>
+      <w:r>
+        <w:rPr>
+          <w:rFonts w:eastAsiaTheme="minorEastAsia"/>
+          <w:noProof/>
+        </w:rPr>
         <w:lastRenderedPageBreak/>
-        <w:t xml:space="preserve">Experiment </w:t>
-      </w:r>
-      <w:r>
-        <w:rPr>
-          <w:rFonts w:eastAsiaTheme="minorEastAsia" w:hint="eastAsia"/>
-        </w:rPr>
-        <w:t>4</w:t>
-      </w:r>
-    </w:p>
-    <w:p>
-      <w:pPr>
-        <w:ind w:firstLine="480"/>
-        <w:rPr>
-          <w:rFonts w:eastAsiaTheme="minorEastAsia"/>
-        </w:rPr>
-      </w:pPr>
-      <w:r>
-        <w:rPr>
-          <w:rFonts w:eastAsiaTheme="minorEastAsia"/>
-        </w:rPr>
-        <w:t>When the light is swept from LDR1 to LDR2, the following data is obtained:</w:t>
-      </w:r>
-      <w:r>
-        <w:rPr>
-          <w:rFonts w:eastAsiaTheme="minorEastAsia"/>
-          <w:noProof/>
-        </w:rPr>
         <w:drawing>
           <wp:inline distT="0" distB="0" distL="0" distR="0" wp14:anchorId="32186BD9" wp14:editId="404BDEE0">
             <wp:extent cx="5943600" cy="1350645"/>
@@ -4139,7 +4193,7 @@
           <w:noProof/>
         </w:rPr>
         <w:drawing>
-          <wp:anchor distT="0" distB="0" distL="114300" distR="114300" simplePos="0" relativeHeight="251661312" behindDoc="0" locked="0" layoutInCell="1" allowOverlap="1" wp14:anchorId="1F916777" wp14:editId="4CFECEA0">
+          <wp:anchor distT="0" distB="0" distL="114300" distR="114300" simplePos="0" relativeHeight="251661312" behindDoc="0" locked="0" layoutInCell="1" allowOverlap="1" wp14:anchorId="1F916777" wp14:editId="38E0510D">
             <wp:simplePos x="0" y="0"/>
             <wp:positionH relativeFrom="column">
               <wp:posOffset>4763</wp:posOffset>
@@ -4253,6 +4307,7 @@
       <w:pPr>
         <w:widowControl/>
         <w:ind w:firstLine="480"/>
+        <w:jc w:val="center"/>
         <w:rPr>
           <w:rFonts w:eastAsiaTheme="minorEastAsia"/>
           <w:szCs w:val="21"/>
@@ -4264,9 +4319,9 @@
           <w:szCs w:val="21"/>
         </w:rPr>
         <w:drawing>
-          <wp:inline distT="0" distB="0" distL="0" distR="0" wp14:anchorId="4AC50177" wp14:editId="7F8892A9">
-            <wp:extent cx="5943600" cy="1252855"/>
-            <wp:effectExtent l="0" t="0" r="0" b="4445"/>
+          <wp:inline distT="0" distB="0" distL="0" distR="0" wp14:anchorId="4AC50177" wp14:editId="44C906EA">
+            <wp:extent cx="5493843" cy="1529715"/>
+            <wp:effectExtent l="0" t="0" r="5715" b="0"/>
             <wp:docPr id="1697536241" name="图片 1"/>
             <wp:cNvGraphicFramePr>
               <a:graphicFrameLocks xmlns:a="http://schemas.openxmlformats.org/drawingml/2006/main" noChangeAspect="1"/>
@@ -4278,20 +4333,27 @@
                     <pic:cNvPr id="1697536241" name=""/>
                     <pic:cNvPicPr/>
                   </pic:nvPicPr>
-                  <pic:blipFill>
+                  <pic:blipFill rotWithShape="1">
                     <a:blip r:embed="rId32"/>
-                    <a:stretch>
-                      <a:fillRect/>
-                    </a:stretch>
+                    <a:srcRect l="12187" r="12110"/>
+                    <a:stretch/>
                   </pic:blipFill>
-                  <pic:spPr>
+                  <pic:spPr bwMode="auto">
                     <a:xfrm>
                       <a:off x="0" y="0"/>
-                      <a:ext cx="5943600" cy="1252855"/>
+                      <a:ext cx="5777459" cy="1608685"/>
                     </a:xfrm>
                     <a:prstGeom prst="rect">
                       <a:avLst/>
                     </a:prstGeom>
+                    <a:ln>
+                      <a:noFill/>
+                    </a:ln>
+                    <a:extLst>
+                      <a:ext uri="{53640926-AAD7-44D8-BBD7-CCE9431645EC}">
+                        <a14:shadowObscured xmlns:a14="http://schemas.microsoft.com/office/drawing/2010/main"/>
+                      </a:ext>
+                    </a:extLst>
                   </pic:spPr>
                 </pic:pic>
               </a:graphicData>
@@ -4560,7 +4622,6 @@
         <w:rPr>
           <w:rFonts w:eastAsia="宋体"/>
         </w:rPr>
-        <w:lastRenderedPageBreak/>
         <w:t>2</w:t>
       </w:r>
       <w:r>
@@ -4574,18 +4635,6 @@
           <w:rFonts w:eastAsia="宋体"/>
         </w:rPr>
         <w:t>Achieving a smooth variation in light intensity proved challenging, resulting in abrupt changes in the data and the curve.</w:t>
-      </w:r>
-    </w:p>
-    <w:p>
-      <w:pPr>
-        <w:widowControl/>
-        <w:ind w:firstLine="480"/>
-      </w:pPr>
-      <w:r>
-        <w:rPr>
-          <w:rFonts w:hint="eastAsia"/>
-        </w:rPr>
-        <w:br w:type="page"/>
       </w:r>
     </w:p>
     <w:p>

</xml_diff>

<commit_message>
changes section title sizes
</commit_message>
<xml_diff>
--- a/Labs/Lab1/group15 lab1.docx
+++ b/Labs/Lab1/group15 lab1.docx
@@ -18,10 +18,16 @@
     <w:p>
       <w:pPr>
         <w:pStyle w:val="1"/>
+        <w:rPr>
+          <w:sz w:val="28"/>
+          <w:szCs w:val="28"/>
+        </w:rPr>
       </w:pPr>
       <w:r>
         <w:rPr>
           <w:rFonts w:hint="eastAsia"/>
+          <w:sz w:val="28"/>
+          <w:szCs w:val="28"/>
         </w:rPr>
         <w:t>Introduction</w:t>
       </w:r>
@@ -33,27 +39,52 @@
       <w:r>
         <w:t>This laboratory investigation systematically characterizes the optoelectronic properties of light-dependent resistors (LDRs) through four complementary experimental approaches.</w:t>
       </w:r>
+      <w:r>
+        <w:rPr>
+          <w:rFonts w:hint="eastAsia"/>
+        </w:rPr>
+        <w:t xml:space="preserve"> The first</w:t>
+      </w:r>
+      <w:r>
+        <w:t xml:space="preserve"> two </w:t>
+      </w:r>
     </w:p>
     <w:p>
       <w:pPr>
         <w:pStyle w:val="2"/>
-      </w:pPr>
-      <w:r>
+        <w:rPr>
+          <w:sz w:val="24"/>
+          <w:szCs w:val="24"/>
+        </w:rPr>
+      </w:pPr>
+      <w:r>
+        <w:rPr>
+          <w:sz w:val="24"/>
+          <w:szCs w:val="24"/>
+        </w:rPr>
         <w:t>Experiment 1: Investigating the "</w:t>
       </w:r>
       <w:r>
         <w:rPr>
           <w:rFonts w:eastAsiaTheme="minorEastAsia"/>
+          <w:sz w:val="24"/>
+          <w:szCs w:val="24"/>
         </w:rPr>
         <w:t>Light Intensity</w:t>
       </w:r>
       <w:r>
         <w:rPr>
           <w:rFonts w:hint="eastAsia"/>
+          <w:sz w:val="24"/>
+          <w:szCs w:val="24"/>
         </w:rPr>
         <w:t>-</w:t>
       </w:r>
       <w:r>
+        <w:rPr>
+          <w:sz w:val="24"/>
+          <w:szCs w:val="24"/>
+        </w:rPr>
         <w:t>Resistance" Changes of LDR under Different Light Conditions with Ground and Power Supply Connections</w:t>
       </w:r>
     </w:p>
@@ -101,26 +132,46 @@
     <w:p>
       <w:pPr>
         <w:pStyle w:val="2"/>
-      </w:pPr>
-      <w:r>
+        <w:rPr>
+          <w:sz w:val="24"/>
+          <w:szCs w:val="24"/>
+        </w:rPr>
+      </w:pPr>
+      <w:r>
+        <w:rPr>
+          <w:sz w:val="24"/>
+          <w:szCs w:val="24"/>
+        </w:rPr>
         <w:t>Experiment 2: Plotting the "</w:t>
       </w:r>
       <w:r>
         <w:rPr>
           <w:rFonts w:eastAsiaTheme="minorEastAsia"/>
+          <w:sz w:val="24"/>
+          <w:szCs w:val="24"/>
         </w:rPr>
         <w:t>Light Intensity</w:t>
       </w:r>
       <w:r>
         <w:rPr>
           <w:rFonts w:hint="eastAsia"/>
+          <w:sz w:val="24"/>
+          <w:szCs w:val="24"/>
         </w:rPr>
         <w:t>-</w:t>
       </w:r>
       <w:r>
+        <w:rPr>
+          <w:sz w:val="24"/>
+          <w:szCs w:val="24"/>
+        </w:rPr>
         <w:t>Resistance</w:t>
       </w:r>
       <w:r>
+        <w:rPr>
+          <w:sz w:val="24"/>
+          <w:szCs w:val="24"/>
+        </w:rPr>
         <w:t>" Changes of LDR under Different Light Intensities</w:t>
       </w:r>
     </w:p>
@@ -146,8 +197,16 @@
     <w:p>
       <w:pPr>
         <w:pStyle w:val="2"/>
-      </w:pPr>
-      <w:r>
+        <w:rPr>
+          <w:sz w:val="24"/>
+          <w:szCs w:val="24"/>
+        </w:rPr>
+      </w:pPr>
+      <w:r>
+        <w:rPr>
+          <w:sz w:val="24"/>
+          <w:szCs w:val="24"/>
+        </w:rPr>
         <w:t>Experiment 3: Comparison of the Change Range When LDR is Connected in Series with Different Voltage Divider Resistors</w:t>
       </w:r>
     </w:p>
@@ -173,8 +232,16 @@
     <w:p>
       <w:pPr>
         <w:pStyle w:val="2"/>
-      </w:pPr>
-      <w:r>
+        <w:rPr>
+          <w:sz w:val="24"/>
+          <w:szCs w:val="24"/>
+        </w:rPr>
+      </w:pPr>
+      <w:r>
+        <w:rPr>
+          <w:sz w:val="24"/>
+          <w:szCs w:val="24"/>
+        </w:rPr>
         <w:t>Experiment 4: Investigating the Resistance Difference Between Two LDRs Under Identical Light Conditions</w:t>
       </w:r>
     </w:p>
@@ -206,10 +273,16 @@
     <w:p>
       <w:pPr>
         <w:pStyle w:val="1"/>
+        <w:rPr>
+          <w:sz w:val="28"/>
+          <w:szCs w:val="28"/>
+        </w:rPr>
       </w:pPr>
       <w:r>
         <w:rPr>
           <w:rFonts w:hint="eastAsia"/>
+          <w:sz w:val="28"/>
+          <w:szCs w:val="28"/>
         </w:rPr>
         <w:t>Theory and Technical Background</w:t>
       </w:r>
@@ -472,6 +545,7 @@
         <w:rPr>
           <w:noProof/>
         </w:rPr>
+        <w:lastRenderedPageBreak/>
         <w:drawing>
           <wp:inline distT="0" distB="0" distL="0" distR="0" wp14:anchorId="253792E2" wp14:editId="600AADEF">
             <wp:extent cx="2172353" cy="2195512"/>
@@ -593,18 +667,25 @@
     <w:p>
       <w:pPr>
         <w:pStyle w:val="1"/>
+        <w:rPr>
+          <w:sz w:val="28"/>
+          <w:szCs w:val="28"/>
+        </w:rPr>
       </w:pPr>
       <w:r>
         <w:rPr>
           <w:rFonts w:hint="eastAsia"/>
+          <w:sz w:val="28"/>
+          <w:szCs w:val="28"/>
         </w:rPr>
         <w:t>Method</w:t>
       </w:r>
       <w:r>
         <w:rPr>
-          <w:rFonts w:hint="eastAsia"/>
-        </w:rPr>
-        <w:t>：</w:t>
+          <w:sz w:val="28"/>
+          <w:szCs w:val="28"/>
+        </w:rPr>
+        <w:t xml:space="preserve">: </w:t>
       </w:r>
     </w:p>
     <w:tbl>
@@ -645,6 +726,7 @@
                 <w:p>
                   <w:pPr>
                     <w:ind w:firstLineChars="0" w:firstLine="0"/>
+                    <w:jc w:val="center"/>
                     <w:rPr>
                       <w:rFonts w:eastAsiaTheme="minorEastAsia"/>
                     </w:rPr>
@@ -685,6 +767,7 @@
                 <w:p>
                   <w:pPr>
                     <w:ind w:firstLineChars="0" w:firstLine="0"/>
+                    <w:jc w:val="center"/>
                   </w:pPr>
                   <w:r>
                     <w:t>ADC</w:t>
@@ -740,6 +823,7 @@
                 <w:p>
                   <w:pPr>
                     <w:ind w:firstLineChars="0" w:firstLine="0"/>
+                    <w:jc w:val="center"/>
                   </w:pPr>
                   <w:r>
                     <w:t>IDE</w:t>
@@ -768,6 +852,7 @@
                 <w:p>
                   <w:pPr>
                     <w:ind w:firstLineChars="0" w:firstLine="0"/>
+                    <w:jc w:val="center"/>
                   </w:pPr>
                   <w:r>
                     <w:rPr>
@@ -827,6 +912,7 @@
     <w:p>
       <w:pPr>
         <w:ind w:firstLine="480"/>
+        <w:jc w:val="center"/>
         <w:rPr>
           <w:rFonts w:eastAsia="宋体"/>
           <w:b/>
@@ -909,8 +995,16 @@
     <w:p>
       <w:pPr>
         <w:pStyle w:val="2"/>
-      </w:pPr>
-      <w:r>
+        <w:rPr>
+          <w:sz w:val="24"/>
+          <w:szCs w:val="24"/>
+        </w:rPr>
+      </w:pPr>
+      <w:r>
+        <w:rPr>
+          <w:sz w:val="24"/>
+          <w:szCs w:val="24"/>
+        </w:rPr>
         <w:t>Experiment 1: Investigating the "Resistance-Time" Changes of LDR under Different Light Conditions with Ground and Power Supply Connections</w:t>
       </w:r>
     </w:p>
@@ -1546,8 +1640,16 @@
     <w:p>
       <w:pPr>
         <w:pStyle w:val="2"/>
-      </w:pPr>
-      <w:r>
+        <w:rPr>
+          <w:sz w:val="24"/>
+          <w:szCs w:val="24"/>
+        </w:rPr>
+      </w:pPr>
+      <w:r>
+        <w:rPr>
+          <w:sz w:val="24"/>
+          <w:szCs w:val="24"/>
+        </w:rPr>
         <w:t>Experiment 2: Plotting the "Resistance-Time" Changes of LDR under Different Light Intensities</w:t>
       </w:r>
     </w:p>
@@ -1723,8 +1825,16 @@
     <w:p>
       <w:pPr>
         <w:pStyle w:val="2"/>
-      </w:pPr>
-      <w:r>
+        <w:rPr>
+          <w:sz w:val="24"/>
+          <w:szCs w:val="24"/>
+        </w:rPr>
+      </w:pPr>
+      <w:r>
+        <w:rPr>
+          <w:sz w:val="24"/>
+          <w:szCs w:val="24"/>
+        </w:rPr>
         <w:t>Experiment 3: Comparison of the Change Range When LDR is Connected in Series with Different Voltage Divider Resistors</w:t>
       </w:r>
     </w:p>
@@ -2173,9 +2283,15 @@
         <w:pStyle w:val="2"/>
         <w:rPr>
           <w:rFonts w:eastAsia="宋体"/>
-        </w:rPr>
-      </w:pPr>
-      <w:r>
+          <w:sz w:val="24"/>
+          <w:szCs w:val="24"/>
+        </w:rPr>
+      </w:pPr>
+      <w:r>
+        <w:rPr>
+          <w:sz w:val="24"/>
+          <w:szCs w:val="24"/>
+        </w:rPr>
         <w:t>Experiment 4: Investigating the Resistance Difference Between Two LDRs Under Identical Light Conditions</w:t>
       </w:r>
     </w:p>
@@ -2392,10 +2508,16 @@
     <w:p>
       <w:pPr>
         <w:pStyle w:val="1"/>
+        <w:rPr>
+          <w:sz w:val="28"/>
+          <w:szCs w:val="28"/>
+        </w:rPr>
       </w:pPr>
       <w:r>
         <w:rPr>
           <w:rFonts w:hint="eastAsia"/>
+          <w:sz w:val="28"/>
+          <w:szCs w:val="28"/>
         </w:rPr>
         <w:t>Result</w:t>
       </w:r>
@@ -2403,8 +2525,16 @@
     <w:p>
       <w:pPr>
         <w:pStyle w:val="2"/>
-      </w:pPr>
-      <w:r>
+        <w:rPr>
+          <w:sz w:val="24"/>
+          <w:szCs w:val="24"/>
+        </w:rPr>
+      </w:pPr>
+      <w:r>
+        <w:rPr>
+          <w:sz w:val="24"/>
+          <w:szCs w:val="24"/>
+        </w:rPr>
         <w:t>Experiment 1</w:t>
       </w:r>
     </w:p>
@@ -2914,14 +3044,22 @@
         <w:pStyle w:val="2"/>
         <w:rPr>
           <w:rFonts w:eastAsiaTheme="minorEastAsia"/>
-        </w:rPr>
-      </w:pPr>
-      <w:r>
+          <w:sz w:val="24"/>
+          <w:szCs w:val="24"/>
+        </w:rPr>
+      </w:pPr>
+      <w:r>
+        <w:rPr>
+          <w:sz w:val="24"/>
+          <w:szCs w:val="24"/>
+        </w:rPr>
         <w:t xml:space="preserve">Experiment </w:t>
       </w:r>
       <w:r>
         <w:rPr>
           <w:rFonts w:eastAsiaTheme="minorEastAsia" w:hint="eastAsia"/>
+          <w:sz w:val="24"/>
+          <w:szCs w:val="24"/>
         </w:rPr>
         <w:t>2</w:t>
       </w:r>
@@ -3209,14 +3347,22 @@
         <w:pStyle w:val="2"/>
         <w:rPr>
           <w:rFonts w:eastAsiaTheme="minorEastAsia"/>
-        </w:rPr>
-      </w:pPr>
-      <w:r>
+          <w:sz w:val="24"/>
+          <w:szCs w:val="24"/>
+        </w:rPr>
+      </w:pPr>
+      <w:r>
+        <w:rPr>
+          <w:sz w:val="24"/>
+          <w:szCs w:val="24"/>
+        </w:rPr>
         <w:t xml:space="preserve">Experiment </w:t>
       </w:r>
       <w:r>
         <w:rPr>
           <w:rFonts w:eastAsiaTheme="minorEastAsia" w:hint="eastAsia"/>
+          <w:sz w:val="24"/>
+          <w:szCs w:val="24"/>
         </w:rPr>
         <w:t>3</w:t>
       </w:r>
@@ -4889,20 +5035,32 @@
     <w:p>
       <w:pPr>
         <w:pStyle w:val="1"/>
+        <w:rPr>
+          <w:sz w:val="28"/>
+          <w:szCs w:val="28"/>
+        </w:rPr>
       </w:pPr>
       <w:r>
         <w:rPr>
           <w:rFonts w:hint="eastAsia"/>
+          <w:sz w:val="28"/>
+          <w:szCs w:val="28"/>
         </w:rPr>
         <w:lastRenderedPageBreak/>
         <w:t>A</w:t>
       </w:r>
       <w:r>
+        <w:rPr>
+          <w:sz w:val="28"/>
+          <w:szCs w:val="28"/>
+        </w:rPr>
         <w:t>ppendi</w:t>
       </w:r>
       <w:r>
         <w:rPr>
           <w:rFonts w:hint="eastAsia"/>
+          <w:sz w:val="28"/>
+          <w:szCs w:val="28"/>
         </w:rPr>
         <w:t>x</w:t>
       </w:r>

</xml_diff>

<commit_message>
[stanley] update the essay
</commit_message>
<xml_diff>
--- a/Labs/Lab1/group15 lab1.docx
+++ b/Labs/Lab1/group15 lab1.docx
@@ -4765,7 +4765,7 @@
           <w14:ligatures w14:val="none"/>
         </w:rPr>
         <w:drawing>
-          <wp:anchor distT="0" distB="0" distL="114300" distR="114300" simplePos="0" relativeHeight="251664384" behindDoc="0" locked="0" layoutInCell="1" allowOverlap="1" wp14:anchorId="6395CD77" wp14:editId="58987AC6">
+          <wp:anchor distT="0" distB="0" distL="114300" distR="114300" simplePos="0" relativeHeight="251664384" behindDoc="0" locked="0" layoutInCell="1" allowOverlap="1" wp14:anchorId="6395CD77" wp14:editId="3BF7902D">
             <wp:simplePos x="0" y="0"/>
             <wp:positionH relativeFrom="column">
               <wp:posOffset>1219200</wp:posOffset>
@@ -5258,7 +5258,7 @@
           <w:noProof/>
         </w:rPr>
         <w:drawing>
-          <wp:anchor distT="0" distB="0" distL="114300" distR="114300" simplePos="0" relativeHeight="251662336" behindDoc="0" locked="0" layoutInCell="1" allowOverlap="1" wp14:anchorId="15385237" wp14:editId="19331AD1">
+          <wp:anchor distT="0" distB="0" distL="114300" distR="114300" simplePos="0" relativeHeight="251662336" behindDoc="0" locked="0" layoutInCell="1" allowOverlap="1" wp14:anchorId="15385237" wp14:editId="0429358A">
             <wp:simplePos x="0" y="0"/>
             <wp:positionH relativeFrom="column">
               <wp:posOffset>4445</wp:posOffset>
@@ -6226,7 +6226,7 @@
           <w:noProof/>
         </w:rPr>
         <w:drawing>
-          <wp:anchor distT="0" distB="0" distL="114300" distR="114300" simplePos="0" relativeHeight="251661312" behindDoc="0" locked="0" layoutInCell="1" allowOverlap="1" wp14:anchorId="1F916777" wp14:editId="3DC71310">
+          <wp:anchor distT="0" distB="0" distL="114300" distR="114300" simplePos="0" relativeHeight="251661312" behindDoc="0" locked="0" layoutInCell="1" allowOverlap="1" wp14:anchorId="1F916777" wp14:editId="0F4C7B77">
             <wp:simplePos x="0" y="0"/>
             <wp:positionH relativeFrom="column">
               <wp:posOffset>4763</wp:posOffset>
@@ -6896,6 +6896,225 @@
           <w:ilvl w:val="0"/>
           <w:numId w:val="16"/>
         </w:numPr>
+        <w:ind w:firstLineChars="0"/>
+        <w:rPr>
+          <w:b/>
+          <w:bCs/>
+        </w:rPr>
+      </w:pPr>
+      <w:r>
+        <w:rPr>
+          <w:b/>
+          <w:bCs/>
+        </w:rPr>
+        <w:t>Group members distribution</w:t>
+      </w:r>
+    </w:p>
+    <w:p>
+      <w:pPr>
+        <w:pStyle w:val="ListParagraph"/>
+        <w:ind w:left="360" w:firstLineChars="0" w:firstLine="0"/>
+      </w:pPr>
+      <w:r>
+        <w:t>Yuwei ZHAO</w:t>
+      </w:r>
+      <w:r>
+        <w:rPr>
+          <w:color w:val="0070C0"/>
+          <w:vertAlign w:val="superscript"/>
+        </w:rPr>
+        <w:fldChar w:fldCharType="begin"/>
+      </w:r>
+      <w:r>
+        <w:rPr>
+          <w:rFonts w:eastAsia="SimSun"/>
+          <w:color w:val="0070C0"/>
+          <w:vertAlign w:val="superscript"/>
+        </w:rPr>
+        <w:instrText xml:space="preserve"> </w:instrText>
+      </w:r>
+      <w:r>
+        <w:rPr>
+          <w:rFonts w:eastAsia="SimSun" w:hint="eastAsia"/>
+          <w:color w:val="0070C0"/>
+          <w:vertAlign w:val="superscript"/>
+        </w:rPr>
+        <w:instrText>= 1 \* GB3</w:instrText>
+      </w:r>
+      <w:r>
+        <w:rPr>
+          <w:rFonts w:eastAsia="SimSun"/>
+          <w:color w:val="0070C0"/>
+          <w:vertAlign w:val="superscript"/>
+        </w:rPr>
+        <w:instrText xml:space="preserve"> </w:instrText>
+      </w:r>
+      <w:r>
+        <w:rPr>
+          <w:color w:val="0070C0"/>
+          <w:vertAlign w:val="superscript"/>
+        </w:rPr>
+        <w:fldChar w:fldCharType="separate"/>
+      </w:r>
+      <w:r>
+        <w:rPr>
+          <w:rFonts w:eastAsia="SimSun" w:hint="eastAsia"/>
+          <w:noProof/>
+          <w:color w:val="0070C0"/>
+          <w:vertAlign w:val="superscript"/>
+        </w:rPr>
+        <w:t>①</w:t>
+      </w:r>
+      <w:r>
+        <w:rPr>
+          <w:color w:val="0070C0"/>
+          <w:vertAlign w:val="superscript"/>
+        </w:rPr>
+        <w:fldChar w:fldCharType="end"/>
+      </w:r>
+      <w:r>
+        <w:t xml:space="preserve"> – Data Processing, Chart Drawing</w:t>
+      </w:r>
+    </w:p>
+    <w:p>
+      <w:pPr>
+        <w:pStyle w:val="ListParagraph"/>
+        <w:ind w:left="360" w:firstLineChars="0" w:firstLine="0"/>
+      </w:pPr>
+      <w:r>
+        <w:t>Haohao QI</w:t>
+      </w:r>
+      <w:r>
+        <w:rPr>
+          <w:color w:val="0070C0"/>
+          <w:vertAlign w:val="superscript"/>
+        </w:rPr>
+        <w:fldChar w:fldCharType="begin"/>
+      </w:r>
+      <w:r>
+        <w:rPr>
+          <w:rFonts w:eastAsia="SimSun"/>
+          <w:color w:val="0070C0"/>
+          <w:vertAlign w:val="superscript"/>
+        </w:rPr>
+        <w:instrText xml:space="preserve"> </w:instrText>
+      </w:r>
+      <w:r>
+        <w:rPr>
+          <w:rFonts w:eastAsia="SimSun" w:hint="eastAsia"/>
+          <w:color w:val="0070C0"/>
+          <w:vertAlign w:val="superscript"/>
+        </w:rPr>
+        <w:instrText>= 2 \* GB3</w:instrText>
+      </w:r>
+      <w:r>
+        <w:rPr>
+          <w:rFonts w:eastAsia="SimSun"/>
+          <w:color w:val="0070C0"/>
+          <w:vertAlign w:val="superscript"/>
+        </w:rPr>
+        <w:instrText xml:space="preserve"> </w:instrText>
+      </w:r>
+      <w:r>
+        <w:rPr>
+          <w:color w:val="0070C0"/>
+          <w:vertAlign w:val="superscript"/>
+        </w:rPr>
+        <w:fldChar w:fldCharType="separate"/>
+      </w:r>
+      <w:r>
+        <w:rPr>
+          <w:rFonts w:eastAsia="SimSun" w:hint="eastAsia"/>
+          <w:noProof/>
+          <w:color w:val="0070C0"/>
+          <w:vertAlign w:val="superscript"/>
+        </w:rPr>
+        <w:t>②</w:t>
+      </w:r>
+      <w:r>
+        <w:rPr>
+          <w:color w:val="0070C0"/>
+          <w:vertAlign w:val="superscript"/>
+        </w:rPr>
+        <w:fldChar w:fldCharType="end"/>
+      </w:r>
+      <w:r>
+        <w:t xml:space="preserve"> – Essay Writing, Experiment Implementing</w:t>
+      </w:r>
+    </w:p>
+    <w:p>
+      <w:pPr>
+        <w:pStyle w:val="ListParagraph"/>
+        <w:ind w:left="360" w:firstLineChars="0" w:firstLine="0"/>
+      </w:pPr>
+      <w:r>
+        <w:t>Yilin ZHANG</w:t>
+      </w:r>
+      <w:r>
+        <w:rPr>
+          <w:color w:val="0070C0"/>
+          <w:vertAlign w:val="superscript"/>
+        </w:rPr>
+        <w:fldChar w:fldCharType="begin"/>
+      </w:r>
+      <w:r>
+        <w:rPr>
+          <w:rFonts w:eastAsia="SimSun"/>
+          <w:color w:val="0070C0"/>
+          <w:vertAlign w:val="superscript"/>
+        </w:rPr>
+        <w:instrText xml:space="preserve"> </w:instrText>
+      </w:r>
+      <w:r>
+        <w:rPr>
+          <w:rFonts w:eastAsia="SimSun" w:hint="eastAsia"/>
+          <w:color w:val="0070C0"/>
+          <w:vertAlign w:val="superscript"/>
+        </w:rPr>
+        <w:instrText>= 3 \* GB3</w:instrText>
+      </w:r>
+      <w:r>
+        <w:rPr>
+          <w:rFonts w:eastAsia="SimSun"/>
+          <w:color w:val="0070C0"/>
+          <w:vertAlign w:val="superscript"/>
+        </w:rPr>
+        <w:instrText xml:space="preserve"> </w:instrText>
+      </w:r>
+      <w:r>
+        <w:rPr>
+          <w:color w:val="0070C0"/>
+          <w:vertAlign w:val="superscript"/>
+        </w:rPr>
+        <w:fldChar w:fldCharType="separate"/>
+      </w:r>
+      <w:r>
+        <w:rPr>
+          <w:rFonts w:eastAsia="SimSun" w:hint="eastAsia"/>
+          <w:noProof/>
+          <w:color w:val="0070C0"/>
+          <w:vertAlign w:val="superscript"/>
+        </w:rPr>
+        <w:t>③</w:t>
+      </w:r>
+      <w:r>
+        <w:rPr>
+          <w:color w:val="0070C0"/>
+          <w:vertAlign w:val="superscript"/>
+        </w:rPr>
+        <w:fldChar w:fldCharType="end"/>
+      </w:r>
+      <w:r>
+        <w:t xml:space="preserve"> – Essay Polishing, Latex Structure Building</w:t>
+      </w:r>
+    </w:p>
+    <w:p>
+      <w:pPr>
+        <w:pStyle w:val="ListParagraph"/>
+        <w:numPr>
+          <w:ilvl w:val="0"/>
+          <w:numId w:val="16"/>
+        </w:numPr>
         <w:spacing w:line="360" w:lineRule="auto"/>
         <w:ind w:left="0" w:firstLineChars="0" w:firstLine="0"/>
         <w:rPr>
@@ -13263,6 +13482,7 @@
           <w:sz w:val="18"/>
           <w:szCs w:val="18"/>
         </w:rPr>
+        <w:lastRenderedPageBreak/>
         <w:t xml:space="preserve">13.     </w:t>
       </w:r>
       <w:r>
@@ -14642,17 +14862,17 @@
   <w:abstractNum w:abstractNumId="7" w15:restartNumberingAfterBreak="0">
     <w:nsid w:val="3B3D6105"/>
     <w:multiLevelType w:val="hybridMultilevel"/>
-    <w:tmpl w:val="1AB4AF0E"/>
+    <w:tmpl w:val="9A76158C"/>
     <w:lvl w:ilvl="0" w:tplc="04090001">
       <w:start w:val="1"/>
       <w:numFmt w:val="bullet"/>
-      <w:lvlText w:val=""/>
+      <w:lvlText w:val=""/>
       <w:lvlJc w:val="left"/>
       <w:pPr>
-        <w:ind w:left="920" w:hanging="440"/>
+        <w:ind w:left="360" w:hanging="360"/>
       </w:pPr>
       <w:rPr>
-        <w:rFonts w:ascii="Wingdings" w:hAnsi="Wingdings" w:hint="default"/>
+        <w:rFonts w:ascii="Symbol" w:hAnsi="Symbol" w:hint="default"/>
       </w:rPr>
     </w:lvl>
     <w:lvl w:ilvl="1" w:tplc="FFFFFFFF" w:tentative="1">

</xml_diff>